<commit_message>
docs 2.4 2.6 mo67 mo68
</commit_message>
<xml_diff>
--- a/Fase 2/Evidencias Grupales/2.6_GuiaEstudiante_Fase 2_Informe_Final_Proyecto APT(Español).docx
+++ b/Fase 2/Evidencias Grupales/2.6_GuiaEstudiante_Fase 2_Informe_Final_Proyecto APT(Español).docx
@@ -2035,7 +2035,6 @@
               <w:t xml:space="preserve"> </w:t>
             </w:r>
             <w:proofErr w:type="spellStart"/>
-            <w:proofErr w:type="gramStart"/>
             <w:r>
               <w:rPr>
                 <w:rFonts w:ascii="Calibri" w:hAnsi="Calibri" w:cs="Arial"/>
@@ -2047,7 +2046,6 @@
               <w:t>NutriHuella</w:t>
             </w:r>
             <w:proofErr w:type="spellEnd"/>
-            <w:proofErr w:type="gramEnd"/>
             <w:r>
               <w:rPr>
                 <w:rFonts w:ascii="Calibri" w:hAnsi="Calibri" w:cs="Arial"/>
@@ -3725,14 +3723,12 @@
             <w:r>
               <w:rPr>
                 <w:rFonts w:ascii="Calibri" w:hAnsi="Calibri" w:cs="Arial"/>
-                <w:b/>
-                <w:bCs/>
-                <w:i/>
-                <w:sz w:val="18"/>
-                <w:szCs w:val="20"/>
-                <w:lang w:eastAsia="es-CL"/>
-              </w:rPr>
-              <w:t>Jira</w:t>
+                <w:i/>
+                <w:sz w:val="18"/>
+                <w:szCs w:val="20"/>
+                <w:lang w:eastAsia="es-CL"/>
+              </w:rPr>
+              <w:t>Trello</w:t>
             </w:r>
             <w:r>
               <w:rPr>
@@ -6259,7 +6255,7 @@
                 <w:szCs w:val="20"/>
                 <w:lang w:eastAsia="es-CL"/>
               </w:rPr>
-              <w:t>Jira</w:t>
+              <w:t>Trello</w:t>
             </w:r>
             <w:r>
               <w:rPr>
@@ -12802,10 +12798,6 @@
 </file>
 
 <file path=customXml/item1.xml><?xml version="1.0" encoding="utf-8"?>
-<b:Sources xmlns:b="http://schemas.openxmlformats.org/officeDocument/2006/bibliography" xmlns="http://schemas.openxmlformats.org/officeDocument/2006/bibliography" SelectedStyle="\APASixthEditionOfficeOnline.xsl" StyleName="APA" Version="6"/>
-</file>
-
-<file path=customXml/item2.xml><?xml version="1.0" encoding="utf-8"?>
 <ct:contentTypeSchema xmlns:ct="http://schemas.microsoft.com/office/2006/metadata/contentType" xmlns:ma="http://schemas.microsoft.com/office/2006/metadata/properties/metaAttributes" ct:_="" ma:_="" ma:contentTypeName="Documento" ma:contentTypeID="0x010100E96778489EE7714D8BD12CC105EB918B" ma:contentTypeVersion="2" ma:contentTypeDescription="Crear nuevo documento." ma:contentTypeScope="" ma:versionID="416c5c7ae9b5d54d83875cd3c65194e3">
   <xsd:schema xmlns:xsd="http://www.w3.org/2001/XMLSchema" xmlns:xs="http://www.w3.org/2001/XMLSchema" xmlns:p="http://schemas.microsoft.com/office/2006/metadata/properties" xmlns:ns2="126e8a1c-9ea9-435a-ac89-d06c80d62e30" targetNamespace="http://schemas.microsoft.com/office/2006/metadata/properties" ma:root="true" ma:fieldsID="70a237c842677bd850644f8595079f5e" ns2:_="">
     <xsd:import namespace="126e8a1c-9ea9-435a-ac89-d06c80d62e30"/>
@@ -12937,13 +12929,11 @@
 </ct:contentTypeSchema>
 </file>
 
-<file path=customXml/item3.xml><?xml version="1.0" encoding="utf-8"?>
-<p:properties xmlns:p="http://schemas.microsoft.com/office/2006/metadata/properties" xmlns:xsi="http://www.w3.org/2001/XMLSchema-instance" xmlns:pc="http://schemas.microsoft.com/office/infopath/2007/PartnerControls">
-  <documentManagement/>
-</p:properties>
+<file path=customXml/item2.xml><?xml version="1.0" encoding="utf-8"?>
+<b:Sources xmlns:b="http://schemas.openxmlformats.org/officeDocument/2006/bibliography" xmlns="http://schemas.openxmlformats.org/officeDocument/2006/bibliography" SelectedStyle="\APASixthEditionOfficeOnline.xsl" StyleName="APA" Version="6"/>
 </file>
 
-<file path=customXml/item4.xml><?xml version="1.0" encoding="utf-8"?>
+<file path=customXml/item3.xml><?xml version="1.0" encoding="utf-8"?>
 <?mso-contentType ?>
 <FormTemplates xmlns="http://schemas.microsoft.com/sharepoint/v3/contenttype/forms">
   <Display>DocumentLibraryForm</Display>
@@ -12952,15 +12942,13 @@
 </FormTemplates>
 </file>
 
-<file path=customXml/itemProps1.xml><?xml version="1.0" encoding="utf-8"?>
-<ds:datastoreItem xmlns:ds="http://schemas.openxmlformats.org/officeDocument/2006/customXml" ds:itemID="{BDCED711-E314-4C22-B587-D275DD8897EC}">
-  <ds:schemaRefs>
-    <ds:schemaRef ds:uri="http://schemas.openxmlformats.org/officeDocument/2006/bibliography"/>
-  </ds:schemaRefs>
-</ds:datastoreItem>
+<file path=customXml/item4.xml><?xml version="1.0" encoding="utf-8"?>
+<p:properties xmlns:p="http://schemas.microsoft.com/office/2006/metadata/properties" xmlns:xsi="http://www.w3.org/2001/XMLSchema-instance" xmlns:pc="http://schemas.microsoft.com/office/infopath/2007/PartnerControls">
+  <documentManagement/>
+</p:properties>
 </file>
 
-<file path=customXml/itemProps2.xml><?xml version="1.0" encoding="utf-8"?>
+<file path=customXml/itemProps1.xml><?xml version="1.0" encoding="utf-8"?>
 <ds:datastoreItem xmlns:ds="http://schemas.openxmlformats.org/officeDocument/2006/customXml" ds:itemID="{1A4E63CB-0BBC-477D-B96D-0B1E89CFECED}">
   <ds:schemaRefs>
     <ds:schemaRef ds:uri="http://schemas.microsoft.com/office/2006/metadata/contentType"/>
@@ -12978,19 +12966,27 @@
 </ds:datastoreItem>
 </file>
 
+<file path=customXml/itemProps2.xml><?xml version="1.0" encoding="utf-8"?>
+<ds:datastoreItem xmlns:ds="http://schemas.openxmlformats.org/officeDocument/2006/customXml" ds:itemID="{BDCED711-E314-4C22-B587-D275DD8897EC}">
+  <ds:schemaRefs>
+    <ds:schemaRef ds:uri="http://schemas.openxmlformats.org/officeDocument/2006/bibliography"/>
+  </ds:schemaRefs>
+</ds:datastoreItem>
+</file>
+
 <file path=customXml/itemProps3.xml><?xml version="1.0" encoding="utf-8"?>
+<ds:datastoreItem xmlns:ds="http://schemas.openxmlformats.org/officeDocument/2006/customXml" ds:itemID="{DB26575A-B7B3-4412-B642-D3B0845180CC}">
+  <ds:schemaRefs>
+    <ds:schemaRef ds:uri="http://schemas.microsoft.com/sharepoint/v3/contenttype/forms"/>
+  </ds:schemaRefs>
+</ds:datastoreItem>
+</file>
+
+<file path=customXml/itemProps4.xml><?xml version="1.0" encoding="utf-8"?>
 <ds:datastoreItem xmlns:ds="http://schemas.openxmlformats.org/officeDocument/2006/customXml" ds:itemID="{372B79FC-6971-4544-98C5-83069028712A}">
   <ds:schemaRefs>
     <ds:schemaRef ds:uri="http://schemas.microsoft.com/office/2006/metadata/properties"/>
     <ds:schemaRef ds:uri="http://schemas.microsoft.com/office/infopath/2007/PartnerControls"/>
   </ds:schemaRefs>
 </ds:datastoreItem>
-</file>
-
-<file path=customXml/itemProps4.xml><?xml version="1.0" encoding="utf-8"?>
-<ds:datastoreItem xmlns:ds="http://schemas.openxmlformats.org/officeDocument/2006/customXml" ds:itemID="{DB26575A-B7B3-4412-B642-D3B0845180CC}">
-  <ds:schemaRefs>
-    <ds:schemaRef ds:uri="http://schemas.microsoft.com/sharepoint/v3/contenttype/forms"/>
-  </ds:schemaRefs>
-</ds:datastoreItem>
 </file>
</xml_diff>